<commit_message>
Rename project from Final Year Project to Course Project
Update title page, declaration, and references throughout the notebook
and report to reflect this is a course project, not a final year project.
</commit_message>
<xml_diff>
--- a/Movie_Recommendation_System_Report.docx
+++ b/Movie_Recommendation_System_Report.docx
@@ -30,7 +30,7 @@
           <w:b/>
           <w:sz w:val="32"/>
         </w:rPr>
-        <w:t>A Final Year Project Report</w:t>
+        <w:t>A Course Project Report</w:t>
       </w:r>
     </w:p>
     <w:p/>
@@ -46,7 +46,7 @@
           <w:b w:val="0"/>
           <w:sz w:val="24"/>
         </w:rPr>
-        <w:t>Submitted in Partial Fulfilment of the Requirements for the Degree of</w:t>
+        <w:t>Submitted in Partial Fulfilment of the Course Requirements for</w:t>
       </w:r>
     </w:p>
     <w:p>
@@ -59,7 +59,7 @@
           <w:b w:val="0"/>
           <w:sz w:val="24"/>
         </w:rPr>
-        <w:t>Bachelor of Science in Artificial Intelligence / Computer Science</w:t>
+        <w:t>Artificial Intelligence / Machine Learning Course</w:t>
       </w:r>
     </w:p>
     <w:p/>
@@ -100,7 +100,7 @@
           <w:b/>
           <w:sz w:val="24"/>
         </w:rPr>
-        <w:t>Supervised By: [Supervisor Name]</w:t>
+        <w:t>Supervised By: [Instructor Name]</w:t>
       </w:r>
     </w:p>
     <w:p/>
@@ -163,7 +163,7 @@
         <w:spacing w:after="160"/>
       </w:pPr>
       <w:r>
-        <w:t>I hereby declare that this project report titled “Movie Recommendation System Using Collaborative Filtering” is my own original work, carried out under the supervision of [Supervisor Name], and has not been submitted elsewhere for the award of any other degree or qualification. All sources of information used in this report have been duly acknowledged in the References section.</w:t>
+        <w:t>I hereby declare that this project report titled “Movie Recommendation System Using Collaborative Filtering” is my own original work, carried out under the supervision of [Instructor Name], and has not been submitted elsewhere for the award of any other degree or qualification. All sources of information used in this report have been duly acknowledged in the References section.</w:t>
       </w:r>
     </w:p>
     <w:p>
@@ -184,7 +184,7 @@
         <w:spacing w:after="160"/>
       </w:pPr>
       <w:r>
-        <w:t>I would like to express my sincere gratitude to my supervisor for their valuable guidance, patience, and continuous support throughout the course of this project. I am also grateful to the faculty members of the Department of Computer Science / Artificial Intelligence for providing the academic foundation necessary to undertake this work.</w:t>
+        <w:t>I would like to express my sincere gratitude to my course instructor for their valuable guidance, patience, and continuous support throughout the course of this project. I am also grateful to the faculty members of the Department of Computer Science / Artificial Intelligence for providing the academic foundation necessary to undertake this work.</w:t>
       </w:r>
     </w:p>
     <w:p>

</xml_diff>